<commit_message>
docs: 规范3.2格式(黑体标题/TNR正文缩进) + feat: TestCostTimeController补全Swagger注解
</commit_message>
<xml_diff>
--- a/软件系统开发实训设计报告_屈焱辉_已修改.docx
+++ b/软件系统开发实训设计报告_屈焱辉_已修改.docx
@@ -4765,11 +4765,11 @@
           <w:sz w:val="24"/>
         </w:rPr>
       </w:pPr>
-      <w:bookmarkStart w:id="0" w:name="_Toc170981864"/>
+      <w:bookmarkStart w:id="0" w:name="_Toc171142109"/>
       <w:bookmarkEnd w:id="0"/>
       <w:bookmarkStart w:id="1" w:name="_Toc170953568"/>
       <w:bookmarkEnd w:id="1"/>
-      <w:bookmarkStart w:id="2" w:name="_Toc171142109"/>
+      <w:bookmarkStart w:id="2" w:name="_Toc170981864"/>
       <w:bookmarkEnd w:id="2"/>
       <w:r>
         <w:rPr>
@@ -6394,6 +6394,8 @@
         </w:rPr>
         <w:t xml:space="preserve">    } else {</w:t>
       </w:r>
+      <w:bookmarkStart w:id="3" w:name="_GoBack"/>
+      <w:bookmarkEnd w:id="3"/>
       <w:r>
         <w:rPr>
           <w:rFonts w:ascii="Times New Roman" w:hAnsi="Times New Roman" w:eastAsia="宋体"/>
@@ -6620,14 +6622,85 @@
     <w:p>
       <w:pPr>
         <w:ind w:firstLine="480"/>
-      </w:pPr>
-      <w:r>
         <w:rPr>
           <w:rFonts w:ascii="Times New Roman" w:hAnsi="Times New Roman"/>
           <w:b w:val="0"/>
           <w:sz w:val="24"/>
         </w:rPr>
+      </w:pPr>
+      <w:r>
+        <w:rPr>
+          <w:rFonts w:ascii="Times New Roman" w:hAnsi="Times New Roman"/>
+          <w:b w:val="0"/>
+          <w:sz w:val="24"/>
+        </w:rPr>
         <w:t>用户登录后持续使用系统，待Access Token临期（剩余不足5分钟）时发起请求。RefreshTokenInterceptor检测到Token即将过期，触发临期刷新逻辑：保持版本号不变，在锁内直接向Redis写入新的Access Token，同时通过响应头"X-Token-Refresh: ok"和"authorization"返回新令牌。前端收到刷新标记后自动更新本地Token，用户无感续期。如图3-7所示。</w:t>
+      </w:r>
+    </w:p>
+    <w:p>
+      <w:pPr>
+        <w:ind w:firstLine="480"/>
+        <w:rPr>
+          <w:rFonts w:ascii="Times New Roman" w:hAnsi="Times New Roman"/>
+          <w:b w:val="0"/>
+          <w:sz w:val="24"/>
+        </w:rPr>
+      </w:pPr>
+      <w:r>
+        <w:rPr>
+          <w:rFonts w:ascii="Times New Roman" w:hAnsi="Times New Roman"/>
+          <w:b w:val="0"/>
+          <w:sz w:val="24"/>
+        </w:rPr>
+        <w:drawing>
+          <wp:anchor distT="0" distB="0" distL="114300" distR="114300" simplePos="0" relativeHeight="251661312" behindDoc="0" locked="0" layoutInCell="1" allowOverlap="1">
+            <wp:simplePos x="0" y="0"/>
+            <wp:positionH relativeFrom="column">
+              <wp:posOffset>0</wp:posOffset>
+            </wp:positionH>
+            <wp:positionV relativeFrom="paragraph">
+              <wp:posOffset>0</wp:posOffset>
+            </wp:positionV>
+            <wp:extent cx="7379970" cy="1858645"/>
+            <wp:effectExtent l="0" t="0" r="11430" b="635"/>
+            <wp:wrapTopAndBottom/>
+            <wp:docPr id="15" name="图片 20"/>
+            <wp:cNvGraphicFramePr>
+              <a:graphicFrameLocks xmlns:a="http://schemas.openxmlformats.org/drawingml/2006/main" noChangeAspect="1"/>
+            </wp:cNvGraphicFramePr>
+            <a:graphic xmlns:a="http://schemas.openxmlformats.org/drawingml/2006/main">
+              <a:graphicData uri="http://schemas.openxmlformats.org/drawingml/2006/picture">
+                <pic:pic xmlns:pic="http://schemas.openxmlformats.org/drawingml/2006/picture">
+                  <pic:nvPicPr>
+                    <pic:cNvPr id="15" name="图片 20"/>
+                    <pic:cNvPicPr>
+                      <a:picLocks noChangeAspect="1"/>
+                    </pic:cNvPicPr>
+                  </pic:nvPicPr>
+                  <pic:blipFill>
+                    <a:blip r:embed="rId15"/>
+                    <a:stretch>
+                      <a:fillRect/>
+                    </a:stretch>
+                  </pic:blipFill>
+                  <pic:spPr>
+                    <a:xfrm>
+                      <a:off x="0" y="0"/>
+                      <a:ext cx="7379970" cy="1858645"/>
+                    </a:xfrm>
+                    <a:prstGeom prst="rect">
+                      <a:avLst/>
+                    </a:prstGeom>
+                    <a:noFill/>
+                    <a:ln>
+                      <a:noFill/>
+                    </a:ln>
+                  </pic:spPr>
+                </pic:pic>
+              </a:graphicData>
+            </a:graphic>
+          </wp:anchor>
+        </w:drawing>
       </w:r>
     </w:p>
     <w:p>
@@ -7097,8 +7170,6 @@
           <w:sz w:val="24"/>
         </w:rPr>
       </w:pPr>
-      <w:bookmarkStart w:id="3" w:name="_GoBack"/>
-      <w:bookmarkEnd w:id="3"/>
     </w:p>
     <w:p>
       <w:pPr>

</xml_diff>